<commit_message>
new post and change fonts
</commit_message>
<xml_diff>
--- a/files/CV_ShengDong.docx
+++ b/files/CV_ShengDong.docx
@@ -18,7 +18,7 @@
           <w:noProof/>
         </w:rPr>
         <w:drawing>
-          <wp:anchor distT="0" distB="0" distL="114300" distR="114300" simplePos="0" relativeHeight="251658240" behindDoc="0" locked="0" layoutInCell="1" allowOverlap="1" wp14:anchorId="58B54483" wp14:editId="4342BFAC">
+          <wp:anchor distT="0" distB="0" distL="114300" distR="114300" simplePos="0" relativeHeight="251658240" behindDoc="0" locked="0" layoutInCell="1" allowOverlap="1" wp14:anchorId="58B54483" wp14:editId="3BCD8F1F">
             <wp:simplePos x="0" y="0"/>
             <wp:positionH relativeFrom="column">
               <wp:posOffset>4377236</wp:posOffset>
@@ -363,13 +363,7 @@
         <w:t>.</w:t>
       </w:r>
     </w:p>
-    <w:p>
-      <w:pPr>
-        <w:rPr>
-          <w:rFonts w:hint="eastAsia"/>
-        </w:rPr>
-      </w:pPr>
-    </w:p>
+    <w:p/>
     <w:p>
       <w:pPr>
         <w:pBdr>
@@ -639,9 +633,6 @@
     <w:p>
       <w:pPr>
         <w:ind w:firstLine="420"/>
-        <w:rPr>
-          <w:rFonts w:hint="eastAsia"/>
-        </w:rPr>
       </w:pPr>
       <w:r>
         <w:t>Chu Kochen Honors College, Zhejiang University</w:t>
@@ -697,12 +688,14 @@
           <w:b/>
           <w:bCs/>
           <w:szCs w:val="21"/>
+          <w:lang w:val="de-DE"/>
         </w:rPr>
         <w:t>Sheng, D.</w:t>
       </w:r>
       <w:r>
         <w:rPr>
           <w:szCs w:val="21"/>
+          <w:lang w:val="de-DE"/>
         </w:rPr>
         <w:t xml:space="preserve">, Jing, S., He, X., Klein, A., Köhler, H., &amp; Wanger, T. C. (2024). </w:t>
       </w:r>
@@ -986,13 +979,7 @@
         <w:t>.</w:t>
       </w:r>
     </w:p>
-    <w:p>
-      <w:pPr>
-        <w:rPr>
-          <w:rFonts w:hint="eastAsia"/>
-        </w:rPr>
-      </w:pPr>
-    </w:p>
+    <w:p/>
     <w:p>
       <w:pPr>
         <w:pBdr>
@@ -1502,9 +1489,6 @@
           <w:tab w:val="left" w:pos="5040"/>
           <w:tab w:val="right" w:pos="9746"/>
         </w:tabs>
-        <w:rPr>
-          <w:rFonts w:hint="eastAsia"/>
-        </w:rPr>
       </w:pPr>
     </w:p>
     <w:sectPr>

</xml_diff>